<commit_message>
Skriv om anslutningsmail-mallen till generell yttrande-mall
Eftersom byalaget inte längre planerar att skicka in det kollektiva
förslaget tas alla referenser till "det kollektiva yttrandet" bort.
Mallen är nu en fristående yttrande-mall där sakägaren själv formulerar
sina synpunkter i avsnittet "Mina synpunkter".

Ändringar:
- Titel: "Anslutningsmail till kollektivt yttrande" → "Mall för enskilt
  yttrande"
- Ärende: "Anslutning till kollektivt yttrande" → "Yttrande över samråd"
- Tar bort meningen om att åberopa kollektivt yttrande med dess lista
  över specifika grunder
- Lägger till platshållare "Mina synpunkter" som sakägaren fyller i
- Tar bort CC-instruktion till "samordnande kontaktperson"
- README-tabell och Viktigt om talerätt-avsnitt anpassade
</commit_message>
<xml_diff>
--- a/yttranden/anslutningsmail_mall.docx
+++ b/yttranden/anslutningsmail_mall.docx
@@ -7,7 +7,7 @@
         <w:pStyle w:val="Title"/>
       </w:pPr>
       <w:r>
-        <w:t xml:space="preserve">Anslutningsmail till kollektivt yttrande – PLAN.2024.747</w:t>
+        <w:t xml:space="preserve">Mall för enskilt yttrande – PLAN.2024.747</w:t>
       </w:r>
     </w:p>
     <w:p>
@@ -37,7 +37,7 @@
           <w:b/>
           <w:bCs/>
         </w:rPr>
-        <w:t xml:space="preserve">Instruktion till varje undertecknande granne:</w:t>
+        <w:t xml:space="preserve">Instruktion till varje enskild sakägare:</w:t>
       </w:r>
       <w:r>
         <w:br/>
@@ -71,7 +71,7 @@
         <w:t xml:space="preserve">2026-05-25</w:t>
       </w:r>
       <w:r>
-        <w:t xml:space="preserve">. Fyll i de fyra fält som är markerade med</w:t>
+        <w:t xml:space="preserve">. Fyll i fälten som är markerade med</w:t>
       </w:r>
       <w:r>
         <w:t xml:space="preserve"> </w:t>
@@ -83,23 +83,10 @@
         <w:t xml:space="preserve">[…]</w:t>
       </w:r>
       <w:r>
-        <w:t xml:space="preserve">. Detta säkerställer att du registreras som</w:t>
-      </w:r>
-      <w:r>
         <w:t xml:space="preserve"> </w:t>
       </w:r>
       <w:r>
-        <w:rPr>
-          <w:i/>
-          <w:iCs/>
-        </w:rPr>
-        <w:t xml:space="preserve">enskild sakägare</w:t>
-      </w:r>
-      <w:r>
-        <w:t xml:space="preserve"> </w:t>
-      </w:r>
-      <w:r>
-        <w:t xml:space="preserve">med individuell talerätt – inte enbart som medlem i en kollektiv skrivelse. Skicka även en kopia (cc) till</w:t>
+        <w:t xml:space="preserve">– särskilt avsnittet</w:t>
       </w:r>
       <w:r>
         <w:t xml:space="preserve"> </w:t>
@@ -109,31 +96,10 @@
           <w:b/>
           <w:bCs/>
         </w:rPr>
-        <w:t xml:space="preserve">[Samordnande kontaktperson]</w:t>
-      </w:r>
-      <w:r>
-        <w:t xml:space="preserve"> </w:t>
-      </w:r>
-      <w:r>
-        <w:t xml:space="preserve">(</w:t>
-      </w:r>
-      <w:r>
-        <w:rPr>
-          <w:rStyle w:val="VerbatimChar"/>
-        </w:rPr>
-        <w:t xml:space="preserve">[kontaktuppgifter på begäran]</w:t>
-      </w:r>
-      <w:r>
-        <w:t xml:space="preserve">) och en kopia till Länsstyrelsen i Västra Götaland (</w:t>
-      </w:r>
-      <w:r>
-        <w:rPr>
-          <w:rStyle w:val="VerbatimChar"/>
-        </w:rPr>
-        <w:t xml:space="preserve">vastragotaland@lansstyrelsen.se</w:t>
-      </w:r>
-      <w:r>
-        <w:t xml:space="preserve">) för känedom.</w:t>
+        <w:t xml:space="preserve">"Mina synpunkter"</w:t>
+      </w:r>
+      <w:r>
+        <w:t xml:space="preserve">, där du formulerar dina egna invändningar och önskemål. Varje sakägare måste lämna sitt eget yttrande för att bevara individuell talerätt enligt 13 kap. 11 § PBL.</w:t>
       </w:r>
     </w:p>
     <w:p>
@@ -190,7 +156,7 @@
         <w:t xml:space="preserve"> </w:t>
       </w:r>
       <w:r>
-        <w:t xml:space="preserve">Anslutning till kollektivt yttrande – Detaljplan för bostäder, Ubbhult 2:2 och Håkankila 1:8, Sätila</w:t>
+        <w:t xml:space="preserve">Yttrande över samråd – Detaljplan för bostäder, Ubbhult 2:2 och Håkankila 1:8, Sätila</w:t>
       </w:r>
       <w:r>
         <w:br/>
@@ -207,6 +173,22 @@
       </w:r>
       <w:r>
         <w:t xml:space="preserve">PLAN.2024.747</w:t>
+      </w:r>
+      <w:r>
+        <w:br/>
+      </w:r>
+      <w:r>
+        <w:rPr>
+          <w:b/>
+          <w:bCs/>
+        </w:rPr>
+        <w:t xml:space="preserve">Datum:</w:t>
+      </w:r>
+      <w:r>
+        <w:t xml:space="preserve"> </w:t>
+      </w:r>
+      <w:r>
+        <w:t xml:space="preserve">2026-05-25</w:t>
       </w:r>
     </w:p>
     <w:p>
@@ -260,31 +242,38 @@
         <w:t xml:space="preserve">[postadress]</w:t>
       </w:r>
       <w:r>
-        <w:t xml:space="preserve">, ansluter mig härmed till det kollektiva yttrande som lämnas av undertecknande fastighetsägare i ovan rubricerade ärende, daterat 2026-05-25.</w:t>
-      </w:r>
-    </w:p>
-    <w:p>
-      <w:pPr>
-        <w:pStyle w:val="BodyText"/>
-      </w:pPr>
-      <w:r>
-        <w:t xml:space="preserve">Jag åberopar det kollektiva yttrandet i dess helhet som om det vore mitt eget och anser att de grunder som där anförs – avseende anpassning till områdets karaktär, strandskyddsupphävandet, artskyddet, trafikutredningen, dagvattenhanteringen, ras- och skredrisken, planbeskrivningens innehåll, formella brister i samrådsförfarandet, badplatsen samt konsekvenser för Lygnersvider ga:1 – var och en utgör skäl att inte anta planen i föreslagen utformning.</w:t>
-      </w:r>
-    </w:p>
-    <w:p>
-      <w:pPr>
-        <w:pStyle w:val="BodyText"/>
-      </w:pPr>
-      <w:r>
-        <w:t xml:space="preserve">Jag är sakägare enligt 5 kap. 11 § plan- och bygglagen (2010:900) i förhållande till planområdet.</w:t>
-      </w:r>
-    </w:p>
-    <w:p>
-      <w:pPr>
-        <w:pStyle w:val="BodyText"/>
-      </w:pPr>
-      <w:r>
-        <w:t xml:space="preserve">Jag begär:</w:t>
+        <w:t xml:space="preserve">, är sakägare enligt 5 kap. 11 § plan- och bygglagen (2010:900, PBL) i förhållande till planområdet och lämnar härmed följande synpunkter över rubricerat detaljplaneförslag.</w:t>
+      </w:r>
+    </w:p>
+    <w:bookmarkStart w:id="9" w:name="mina-synpunkter"/>
+    <w:p>
+      <w:pPr>
+        <w:pStyle w:val="Heading3"/>
+      </w:pPr>
+      <w:r>
+        <w:t xml:space="preserve">Mina synpunkter</w:t>
+      </w:r>
+    </w:p>
+    <w:p>
+      <w:pPr>
+        <w:pStyle w:val="FirstParagraph"/>
+      </w:pPr>
+      <w:r>
+        <w:rPr>
+          <w:i/>
+          <w:iCs/>
+        </w:rPr>
+        <w:t xml:space="preserve">[Skriv här dina synpunkter på planen. Var konkret om vad du anser bör ändras, kompletteras eller utredas vidare innan planen kan antas, och förklara varför – gärna med utgångspunkt i din egen situation som sakägare och boende i området. Du kan välja att antingen yrka att planen omarbetas och förs till nytt samråd, att planhandlingarna kompletteras inför granskning, eller att planen inte antas i nuvarande utformning.]</w:t>
+      </w:r>
+    </w:p>
+    <w:bookmarkEnd w:id="9"/>
+    <w:bookmarkStart w:id="10" w:name="begäran-inför-fortsatt-handläggning"/>
+    <w:p>
+      <w:pPr>
+        <w:pStyle w:val="Heading3"/>
+      </w:pPr>
+      <w:r>
+        <w:t xml:space="preserve">Begäran inför fortsatt handläggning</w:t>
       </w:r>
     </w:p>
     <w:p>
@@ -448,22 +437,20 @@
         </w:numPr>
       </w:pPr>
       <w:r>
-        <w:t xml:space="preserve">Lägg gärna in</w:t>
+        <w:t xml:space="preserve">Om du inte fått bekräftelse inom</w:t>
       </w:r>
       <w:r>
         <w:t xml:space="preserve"> </w:t>
       </w:r>
       <w:r>
         <w:rPr>
-          <w:rStyle w:val="VerbatimChar"/>
-        </w:rPr>
-        <w:t xml:space="preserve">[samordnande kontaktpersons mailadress på begäran]</w:t>
-      </w:r>
-      <w:r>
-        <w:t xml:space="preserve"> </w:t>
-      </w:r>
-      <w:r>
-        <w:t xml:space="preserve">som CC så att den samordnande parten vet att du anslutit dig.</w:t>
+          <w:b/>
+          <w:bCs/>
+        </w:rPr>
+        <w:t xml:space="preserve">5 arbetsdagar</w:t>
+      </w:r>
+      <w:r>
+        <w:t xml:space="preserve">, skicka ett uppföljningsmail och be om bekräftelse på diarieföring.</w:t>
       </w:r>
     </w:p>
     <w:p>
@@ -475,7 +462,7 @@
         </w:numPr>
       </w:pPr>
       <w:r>
-        <w:t xml:space="preserve">Om du inte fått bekräftelse inom</w:t>
+        <w:t xml:space="preserve">Personnummer ska</w:t>
       </w:r>
       <w:r>
         <w:t xml:space="preserve"> </w:t>
@@ -485,10 +472,13 @@
           <w:b/>
           <w:bCs/>
         </w:rPr>
-        <w:t xml:space="preserve">5 arbetsdagar</w:t>
-      </w:r>
-      <w:r>
-        <w:t xml:space="preserve">, skicka ett uppföljningsmail och be om bekräftelse på diarieföring.</w:t>
+        <w:t xml:space="preserve">inte</w:t>
+      </w:r>
+      <w:r>
+        <w:t xml:space="preserve"> </w:t>
+      </w:r>
+      <w:r>
+        <w:t xml:space="preserve">anges – det är inte ett krav enligt PBL och kan strida mot GDPR.</w:t>
       </w:r>
     </w:p>
     <w:p>
@@ -500,25 +490,10 @@
         </w:numPr>
       </w:pPr>
       <w:r>
-        <w:t xml:space="preserve">Personnummer ska</w:t>
-      </w:r>
-      <w:r>
-        <w:t xml:space="preserve"> </w:t>
-      </w:r>
-      <w:r>
-        <w:rPr>
-          <w:b/>
-          <w:bCs/>
-        </w:rPr>
-        <w:t xml:space="preserve">inte</w:t>
-      </w:r>
-      <w:r>
-        <w:t xml:space="preserve"> </w:t>
-      </w:r>
-      <w:r>
-        <w:t xml:space="preserve">anges – det är inte ett krav enligt PBL och kan strida mot GDPR.</w:t>
-      </w:r>
-    </w:p>
+        <w:t xml:space="preserve">Om du är osäker på hur du ska formulera dig: skriv på ditt eget sätt om vad som oroar eller engagerar dig kring planen. En kort men personlig text är mer värdefull än en lång generisk.</w:t>
+      </w:r>
+    </w:p>
+    <w:bookmarkEnd w:id="10"/>
     <w:sectPr>
       <w:footnotePr>
         <w:numRestart w:val="eachSect"/>

</xml_diff>